<commit_message>
made changes to index.html and products.html
</commit_message>
<xml_diff>
--- a/Jobeta_Mandisa_Mar2026_A01.docx
+++ b/Jobeta_Mandisa_Mar2026_A01.docx
@@ -907,15 +907,13 @@
         <w:rPr>
           <w:sz w:val="28"/>
           <w:szCs w:val="28"/>
-          <w:u w:val="single"/>
-          <w:lang w:val="en-GB"/>
-        </w:rPr>
-      </w:pPr>
-      <w:r>
-        <w:rPr>
-          <w:sz w:val="28"/>
-          <w:szCs w:val="28"/>
-          <w:u w:val="single"/>
+          <w:lang w:val="en-GB"/>
+        </w:rPr>
+      </w:pPr>
+      <w:r>
+        <w:rPr>
+          <w:sz w:val="28"/>
+          <w:szCs w:val="28"/>
           <w:lang w:val="en-GB"/>
         </w:rPr>
         <w:lastRenderedPageBreak/>
@@ -1184,15 +1182,13 @@
         <w:rPr>
           <w:sz w:val="28"/>
           <w:szCs w:val="28"/>
-          <w:u w:val="single"/>
-          <w:lang w:val="en-GB"/>
-        </w:rPr>
-      </w:pPr>
-      <w:r>
-        <w:rPr>
-          <w:sz w:val="28"/>
-          <w:szCs w:val="28"/>
-          <w:u w:val="single"/>
+          <w:lang w:val="en-GB"/>
+        </w:rPr>
+      </w:pPr>
+      <w:r>
+        <w:rPr>
+          <w:sz w:val="28"/>
+          <w:szCs w:val="28"/>
           <w:lang w:val="en-GB"/>
         </w:rPr>
         <w:t>Client requiremen</w:t>
@@ -1201,7 +1197,6 @@
         <w:rPr>
           <w:sz w:val="28"/>
           <w:szCs w:val="28"/>
-          <w:u w:val="single"/>
           <w:lang w:val="en-GB"/>
         </w:rPr>
         <w:t xml:space="preserve">ts </w:t>
@@ -1516,15 +1511,13 @@
         <w:rPr>
           <w:sz w:val="28"/>
           <w:szCs w:val="28"/>
-          <w:u w:val="single"/>
-          <w:lang w:val="en-GB"/>
-        </w:rPr>
-      </w:pPr>
-      <w:r>
-        <w:rPr>
-          <w:sz w:val="28"/>
-          <w:szCs w:val="28"/>
-          <w:u w:val="single"/>
+          <w:lang w:val="en-GB"/>
+        </w:rPr>
+      </w:pPr>
+      <w:r>
+        <w:rPr>
+          <w:sz w:val="28"/>
+          <w:szCs w:val="28"/>
           <w:lang w:val="en-GB"/>
         </w:rPr>
         <w:t xml:space="preserve">Feasibility </w:t>
@@ -1533,7 +1526,6 @@
         <w:rPr>
           <w:sz w:val="28"/>
           <w:szCs w:val="28"/>
-          <w:u w:val="single"/>
           <w:lang w:val="en-GB"/>
         </w:rPr>
         <w:t>S</w:t>
@@ -1542,7 +1534,6 @@
         <w:rPr>
           <w:sz w:val="28"/>
           <w:szCs w:val="28"/>
-          <w:u w:val="single"/>
           <w:lang w:val="en-GB"/>
         </w:rPr>
         <w:t xml:space="preserve">tudy </w:t>
@@ -1932,62 +1923,43 @@
           <w:szCs w:val="28"/>
           <w:lang w:val="en-GB"/>
         </w:rPr>
-        <w:t xml:space="preserve">According to, </w:t>
-      </w:r>
-      <w:sdt>
-        <w:sdtPr>
-          <w:rPr>
-            <w:sz w:val="28"/>
-            <w:szCs w:val="28"/>
-            <w:lang w:val="en-GB"/>
-          </w:rPr>
-          <w:id w:val="703907692"/>
-          <w:citation/>
-        </w:sdtPr>
-        <w:sdtContent>
-          <w:r>
-            <w:rPr>
-              <w:sz w:val="28"/>
-              <w:szCs w:val="28"/>
-              <w:lang w:val="en-GB"/>
-            </w:rPr>
-            <w:fldChar w:fldCharType="begin"/>
-          </w:r>
-          <w:r>
-            <w:rPr>
-              <w:sz w:val="28"/>
-              <w:szCs w:val="28"/>
-              <w:lang w:val="en-GB"/>
-            </w:rPr>
-            <w:instrText xml:space="preserve"> CITATION Usm24 \l 2057 </w:instrText>
-          </w:r>
-          <w:r>
-            <w:rPr>
-              <w:sz w:val="28"/>
-              <w:szCs w:val="28"/>
-              <w:lang w:val="en-GB"/>
-            </w:rPr>
-            <w:fldChar w:fldCharType="separate"/>
-          </w:r>
-          <w:r>
-            <w:rPr>
-              <w:noProof/>
-              <w:sz w:val="28"/>
-              <w:szCs w:val="28"/>
-              <w:lang w:val="en-GB"/>
-            </w:rPr>
-            <w:t>(Usmani, 2024)</w:t>
-          </w:r>
-          <w:r>
-            <w:rPr>
-              <w:sz w:val="28"/>
-              <w:szCs w:val="28"/>
-              <w:lang w:val="en-GB"/>
-            </w:rPr>
-            <w:fldChar w:fldCharType="end"/>
-          </w:r>
-        </w:sdtContent>
-      </w:sdt>
+        <w:t>According to</w:t>
+      </w:r>
+      <w:r>
+        <w:rPr>
+          <w:sz w:val="28"/>
+          <w:szCs w:val="28"/>
+          <w:lang w:val="en-GB"/>
+        </w:rPr>
+        <w:t xml:space="preserve"> </w:t>
+      </w:r>
+      <w:r>
+        <w:rPr>
+          <w:noProof/>
+          <w:sz w:val="28"/>
+          <w:szCs w:val="28"/>
+          <w:lang w:val="en-GB"/>
+        </w:rPr>
+        <w:t xml:space="preserve">Usmani </w:t>
+      </w:r>
+      <w:r>
+        <w:rPr>
+          <w:noProof/>
+          <w:sz w:val="28"/>
+          <w:szCs w:val="28"/>
+          <w:lang w:val="en-GB"/>
+        </w:rPr>
+        <w:t>(</w:t>
+      </w:r>
+      <w:r>
+        <w:rPr>
+          <w:noProof/>
+          <w:sz w:val="28"/>
+          <w:szCs w:val="28"/>
+          <w:lang w:val="en-GB"/>
+        </w:rPr>
+        <w:t>2024)</w:t>
+      </w:r>
       <w:r>
         <w:rPr>
           <w:sz w:val="28"/>
@@ -2712,7 +2684,7 @@
                     </pic:cNvPicPr>
                   </pic:nvPicPr>
                   <pic:blipFill rotWithShape="1">
-                    <a:blip r:embed="rId6" cstate="print">
+                    <a:blip r:embed="rId8" cstate="print">
                       <a:extLst>
                         <a:ext uri="{28A0092B-C50C-407E-A947-70E740481C1C}">
                           <a14:useLocalDpi xmlns:a14="http://schemas.microsoft.com/office/drawing/2010/main" val="0"/>
@@ -2946,7 +2918,7 @@
                     </pic:cNvPicPr>
                   </pic:nvPicPr>
                   <pic:blipFill>
-                    <a:blip r:embed="rId7">
+                    <a:blip r:embed="rId9">
                       <a:extLst>
                         <a:ext uri="{28A0092B-C50C-407E-A947-70E740481C1C}">
                           <a14:useLocalDpi xmlns:a14="http://schemas.microsoft.com/office/drawing/2010/main" val="0"/>
@@ -3051,7 +3023,7 @@
                     <pic:cNvPicPr/>
                   </pic:nvPicPr>
                   <pic:blipFill>
-                    <a:blip r:embed="rId8"/>
+                    <a:blip r:embed="rId10"/>
                     <a:stretch>
                       <a:fillRect/>
                     </a:stretch>
@@ -3160,7 +3132,7 @@
                     <pic:cNvPicPr/>
                   </pic:nvPicPr>
                   <pic:blipFill>
-                    <a:blip r:embed="rId9"/>
+                    <a:blip r:embed="rId11"/>
                     <a:stretch>
                       <a:fillRect/>
                     </a:stretch>
@@ -3602,14 +3574,7 @@
           <w:sz w:val="28"/>
           <w:szCs w:val="28"/>
         </w:rPr>
-        <w:t>Quality Assurance plays a pivotal role in web development, ensuring that websites are functional, performant, and user-friendly</w:t>
-      </w:r>
-      <w:r>
-        <w:rPr>
-          <w:sz w:val="28"/>
-          <w:szCs w:val="28"/>
-        </w:rPr>
-        <w:t xml:space="preserve"> </w:t>
+        <w:t xml:space="preserve">Quality Assurance plays a pivotal role in web development, ensuring that websites are functional, performant, and user-friendly </w:t>
       </w:r>
       <w:sdt>
         <w:sdtPr>
@@ -4569,7 +4534,7 @@
         </w:rPr>
         <w:t xml:space="preserve">Website link address: </w:t>
       </w:r>
-      <w:hyperlink r:id="rId10" w:history="1">
+      <w:hyperlink r:id="rId12" w:history="1">
         <w:r>
           <w:rPr>
             <w:rStyle w:val="Hyperlink"/>
@@ -4710,6 +4675,7 @@
       </w:pPr>
     </w:p>
     <w:sectPr>
+      <w:footerReference w:type="default" r:id="rId13"/>
       <w:pgSz w:w="11906" w:h="16838"/>
       <w:pgMar w:top="1440" w:right="1440" w:bottom="1440" w:left="1440" w:header="708" w:footer="708" w:gutter="0"/>
       <w:cols w:space="708"/>
@@ -4717,6 +4683,109 @@
     </w:sectPr>
   </w:body>
 </w:document>
+</file>
+
+<file path=word/endnotes.xml><?xml version="1.0" encoding="utf-8"?>
+<w:endnotes xmlns:wpc="http://schemas.microsoft.com/office/word/2010/wordprocessingCanvas" xmlns:cx="http://schemas.microsoft.com/office/drawing/2014/chartex" xmlns:cx1="http://schemas.microsoft.com/office/drawing/2015/9/8/chartex" xmlns:cx2="http://schemas.microsoft.com/office/drawing/2015/10/21/chartex" xmlns:cx3="http://schemas.microsoft.com/office/drawing/2016/5/9/chartex" xmlns:cx4="http://schemas.microsoft.com/office/drawing/2016/5/10/chartex" xmlns:cx5="http://schemas.microsoft.com/office/drawing/2016/5/11/chartex" xmlns:cx6="http://schemas.microsoft.com/office/drawing/2016/5/12/chartex" xmlns:cx7="http://schemas.microsoft.com/office/drawing/2016/5/13/chartex" xmlns:cx8="http://schemas.microsoft.com/office/drawing/2016/5/14/chartex" xmlns:mc="http://schemas.openxmlformats.org/markup-compatibility/2006" xmlns:aink="http://schemas.microsoft.com/office/drawing/2016/ink" xmlns:am3d="http://schemas.microsoft.com/office/drawing/2017/model3d" xmlns:o="urn:schemas-microsoft-com:office:office" xmlns:oel="http://schemas.microsoft.com/office/2019/extlst" xmlns:r="http://schemas.openxmlformats.org/officeDocument/2006/relationships" xmlns:m="http://schemas.openxmlformats.org/officeDocument/2006/math" xmlns:v="urn:schemas-microsoft-com:vml" xmlns:wp14="http://schemas.microsoft.com/office/word/2010/wordprocessingDrawing" xmlns:wp="http://schemas.openxmlformats.org/drawingml/2006/wordprocessingDrawing" xmlns:w10="urn:schemas-microsoft-com:office:word" xmlns:w="http://schemas.openxmlformats.org/wordprocessingml/2006/main" xmlns:w14="http://schemas.microsoft.com/office/word/2010/wordml" xmlns:w15="http://schemas.microsoft.com/office/word/2012/wordml" xmlns:w16cex="http://schemas.microsoft.com/office/word/2018/wordml/cex" xmlns:w16cid="http://schemas.microsoft.com/office/word/2016/wordml/cid" xmlns:w16="http://schemas.microsoft.com/office/word/2018/wordml" xmlns:w16du="http://schemas.microsoft.com/office/word/2023/wordml/word16du" xmlns:w16sdtdh="http://schemas.microsoft.com/office/word/2020/wordml/sdtdatahash" xmlns:w16sdtfl="http://schemas.microsoft.com/office/word/2024/wordml/sdtformatlock" xmlns:w16se="http://schemas.microsoft.com/office/word/2015/wordml/symex" xmlns:wpg="http://schemas.microsoft.com/office/word/2010/wordprocessingGroup" xmlns:wpi="http://schemas.microsoft.com/office/word/2010/wordprocessingInk" xmlns:wne="http://schemas.microsoft.com/office/word/2006/wordml" xmlns:wps="http://schemas.microsoft.com/office/word/2010/wordprocessingShape" mc:Ignorable="w14 w15 w16se w16cid w16 w16cex w16sdtdh w16sdtfl w16du wp14">
+  <w:endnote w:type="separator" w:id="-1">
+    <w:p>
+      <w:pPr>
+        <w:spacing w:after="0" w:line="240" w:lineRule="auto"/>
+      </w:pPr>
+      <w:r>
+        <w:separator/>
+      </w:r>
+    </w:p>
+  </w:endnote>
+  <w:endnote w:type="continuationSeparator" w:id="0">
+    <w:p>
+      <w:pPr>
+        <w:spacing w:after="0" w:line="240" w:lineRule="auto"/>
+      </w:pPr>
+      <w:r>
+        <w:continuationSeparator/>
+      </w:r>
+    </w:p>
+  </w:endnote>
+</w:endnotes>
+</file>
+
+<file path=word/footer1.xml><?xml version="1.0" encoding="utf-8"?>
+<w:ftr xmlns:wpc="http://schemas.microsoft.com/office/word/2010/wordprocessingCanvas" xmlns:cx="http://schemas.microsoft.com/office/drawing/2014/chartex" xmlns:cx1="http://schemas.microsoft.com/office/drawing/2015/9/8/chartex" xmlns:cx2="http://schemas.microsoft.com/office/drawing/2015/10/21/chartex" xmlns:cx3="http://schemas.microsoft.com/office/drawing/2016/5/9/chartex" xmlns:cx4="http://schemas.microsoft.com/office/drawing/2016/5/10/chartex" xmlns:cx5="http://schemas.microsoft.com/office/drawing/2016/5/11/chartex" xmlns:cx6="http://schemas.microsoft.com/office/drawing/2016/5/12/chartex" xmlns:cx7="http://schemas.microsoft.com/office/drawing/2016/5/13/chartex" xmlns:cx8="http://schemas.microsoft.com/office/drawing/2016/5/14/chartex" xmlns:mc="http://schemas.openxmlformats.org/markup-compatibility/2006" xmlns:aink="http://schemas.microsoft.com/office/drawing/2016/ink" xmlns:am3d="http://schemas.microsoft.com/office/drawing/2017/model3d" xmlns:o="urn:schemas-microsoft-com:office:office" xmlns:oel="http://schemas.microsoft.com/office/2019/extlst" xmlns:r="http://schemas.openxmlformats.org/officeDocument/2006/relationships" xmlns:m="http://schemas.openxmlformats.org/officeDocument/2006/math" xmlns:v="urn:schemas-microsoft-com:vml" xmlns:wp14="http://schemas.microsoft.com/office/word/2010/wordprocessingDrawing" xmlns:wp="http://schemas.openxmlformats.org/drawingml/2006/wordprocessingDrawing" xmlns:w10="urn:schemas-microsoft-com:office:word" xmlns:w="http://schemas.openxmlformats.org/wordprocessingml/2006/main" xmlns:w14="http://schemas.microsoft.com/office/word/2010/wordml" xmlns:w15="http://schemas.microsoft.com/office/word/2012/wordml" xmlns:w16cex="http://schemas.microsoft.com/office/word/2018/wordml/cex" xmlns:w16cid="http://schemas.microsoft.com/office/word/2016/wordml/cid" xmlns:w16="http://schemas.microsoft.com/office/word/2018/wordml" xmlns:w16du="http://schemas.microsoft.com/office/word/2023/wordml/word16du" xmlns:w16sdtdh="http://schemas.microsoft.com/office/word/2020/wordml/sdtdatahash" xmlns:w16sdtfl="http://schemas.microsoft.com/office/word/2024/wordml/sdtformatlock" xmlns:w16se="http://schemas.microsoft.com/office/word/2015/wordml/symex" xmlns:wpg="http://schemas.microsoft.com/office/word/2010/wordprocessingGroup" xmlns:wpi="http://schemas.microsoft.com/office/word/2010/wordprocessingInk" xmlns:wne="http://schemas.microsoft.com/office/word/2006/wordml" xmlns:wps="http://schemas.microsoft.com/office/word/2010/wordprocessingShape" mc:Ignorable="w14 w15 w16se w16cid w16 w16cex w16sdtdh w16sdtfl w16du wp14">
+  <w:sdt>
+    <w:sdtPr>
+      <w:id w:val="-17469884"/>
+      <w:docPartObj>
+        <w:docPartGallery w:val="Page Numbers (Bottom of Page)"/>
+        <w:docPartUnique/>
+      </w:docPartObj>
+    </w:sdtPr>
+    <w:sdtEndPr>
+      <w:rPr>
+        <w:noProof/>
+      </w:rPr>
+    </w:sdtEndPr>
+    <w:sdtContent>
+      <w:p>
+        <w:pPr>
+          <w:pStyle w:val="Footer"/>
+          <w:jc w:val="right"/>
+        </w:pPr>
+        <w:r>
+          <w:fldChar w:fldCharType="begin"/>
+        </w:r>
+        <w:r>
+          <w:instrText xml:space="preserve"> PAGE   \* MERGEFORMAT </w:instrText>
+        </w:r>
+        <w:r>
+          <w:fldChar w:fldCharType="separate"/>
+        </w:r>
+        <w:r>
+          <w:rPr>
+            <w:noProof/>
+          </w:rPr>
+          <w:t>2</w:t>
+        </w:r>
+        <w:r>
+          <w:rPr>
+            <w:noProof/>
+          </w:rPr>
+          <w:fldChar w:fldCharType="end"/>
+        </w:r>
+      </w:p>
+    </w:sdtContent>
+  </w:sdt>
+  <w:p>
+    <w:pPr>
+      <w:pStyle w:val="Footer"/>
+    </w:pPr>
+  </w:p>
+</w:ftr>
+</file>
+
+<file path=word/footnotes.xml><?xml version="1.0" encoding="utf-8"?>
+<w:footnotes xmlns:wpc="http://schemas.microsoft.com/office/word/2010/wordprocessingCanvas" xmlns:cx="http://schemas.microsoft.com/office/drawing/2014/chartex" xmlns:cx1="http://schemas.microsoft.com/office/drawing/2015/9/8/chartex" xmlns:cx2="http://schemas.microsoft.com/office/drawing/2015/10/21/chartex" xmlns:cx3="http://schemas.microsoft.com/office/drawing/2016/5/9/chartex" xmlns:cx4="http://schemas.microsoft.com/office/drawing/2016/5/10/chartex" xmlns:cx5="http://schemas.microsoft.com/office/drawing/2016/5/11/chartex" xmlns:cx6="http://schemas.microsoft.com/office/drawing/2016/5/12/chartex" xmlns:cx7="http://schemas.microsoft.com/office/drawing/2016/5/13/chartex" xmlns:cx8="http://schemas.microsoft.com/office/drawing/2016/5/14/chartex" xmlns:mc="http://schemas.openxmlformats.org/markup-compatibility/2006" xmlns:aink="http://schemas.microsoft.com/office/drawing/2016/ink" xmlns:am3d="http://schemas.microsoft.com/office/drawing/2017/model3d" xmlns:o="urn:schemas-microsoft-com:office:office" xmlns:oel="http://schemas.microsoft.com/office/2019/extlst" xmlns:r="http://schemas.openxmlformats.org/officeDocument/2006/relationships" xmlns:m="http://schemas.openxmlformats.org/officeDocument/2006/math" xmlns:v="urn:schemas-microsoft-com:vml" xmlns:wp14="http://schemas.microsoft.com/office/word/2010/wordprocessingDrawing" xmlns:wp="http://schemas.openxmlformats.org/drawingml/2006/wordprocessingDrawing" xmlns:w10="urn:schemas-microsoft-com:office:word" xmlns:w="http://schemas.openxmlformats.org/wordprocessingml/2006/main" xmlns:w14="http://schemas.microsoft.com/office/word/2010/wordml" xmlns:w15="http://schemas.microsoft.com/office/word/2012/wordml" xmlns:w16cex="http://schemas.microsoft.com/office/word/2018/wordml/cex" xmlns:w16cid="http://schemas.microsoft.com/office/word/2016/wordml/cid" xmlns:w16="http://schemas.microsoft.com/office/word/2018/wordml" xmlns:w16du="http://schemas.microsoft.com/office/word/2023/wordml/word16du" xmlns:w16sdtdh="http://schemas.microsoft.com/office/word/2020/wordml/sdtdatahash" xmlns:w16sdtfl="http://schemas.microsoft.com/office/word/2024/wordml/sdtformatlock" xmlns:w16se="http://schemas.microsoft.com/office/word/2015/wordml/symex" xmlns:wpg="http://schemas.microsoft.com/office/word/2010/wordprocessingGroup" xmlns:wpi="http://schemas.microsoft.com/office/word/2010/wordprocessingInk" xmlns:wne="http://schemas.microsoft.com/office/word/2006/wordml" xmlns:wps="http://schemas.microsoft.com/office/word/2010/wordprocessingShape" mc:Ignorable="w14 w15 w16se w16cid w16 w16cex w16sdtdh w16sdtfl w16du wp14">
+  <w:footnote w:type="separator" w:id="-1">
+    <w:p>
+      <w:pPr>
+        <w:spacing w:after="0" w:line="240" w:lineRule="auto"/>
+      </w:pPr>
+      <w:r>
+        <w:separator/>
+      </w:r>
+    </w:p>
+  </w:footnote>
+  <w:footnote w:type="continuationSeparator" w:id="0">
+    <w:p>
+      <w:pPr>
+        <w:spacing w:after="0" w:line="240" w:lineRule="auto"/>
+      </w:pPr>
+      <w:r>
+        <w:continuationSeparator/>
+      </w:r>
+    </w:p>
+  </w:footnote>
+</w:footnotes>
 </file>
 
 <file path=word/numbering.xml><?xml version="1.0" encoding="utf-8"?>
@@ -5883,6 +5952,7 @@
   <w:style w:type="character" w:default="1" w:styleId="DefaultParagraphFont">
     <w:name w:val="Default Paragraph Font"/>
     <w:uiPriority w:val="1"/>
+    <w:semiHidden/>
     <w:unhideWhenUsed/>
   </w:style>
   <w:style w:type="table" w:default="1" w:styleId="TableNormal">
@@ -6245,6 +6315,50 @@
         <w:insideV w:val="single" w:sz="4" w:space="0" w:color="auto"/>
       </w:tblBorders>
     </w:tblPr>
+  </w:style>
+  <w:style w:type="paragraph" w:styleId="Header">
+    <w:name w:val="header"/>
+    <w:basedOn w:val="Normal"/>
+    <w:link w:val="HeaderChar"/>
+    <w:uiPriority w:val="99"/>
+    <w:unhideWhenUsed/>
+    <w:rsid w:val="00090478"/>
+    <w:pPr>
+      <w:tabs>
+        <w:tab w:val="center" w:pos="4513"/>
+        <w:tab w:val="right" w:pos="9026"/>
+      </w:tabs>
+      <w:spacing w:after="0" w:line="240" w:lineRule="auto"/>
+    </w:pPr>
+  </w:style>
+  <w:style w:type="character" w:customStyle="1" w:styleId="HeaderChar">
+    <w:name w:val="Header Char"/>
+    <w:basedOn w:val="DefaultParagraphFont"/>
+    <w:link w:val="Header"/>
+    <w:uiPriority w:val="99"/>
+    <w:rsid w:val="00090478"/>
+  </w:style>
+  <w:style w:type="paragraph" w:styleId="Footer">
+    <w:name w:val="footer"/>
+    <w:basedOn w:val="Normal"/>
+    <w:link w:val="FooterChar"/>
+    <w:uiPriority w:val="99"/>
+    <w:unhideWhenUsed/>
+    <w:rsid w:val="00090478"/>
+    <w:pPr>
+      <w:tabs>
+        <w:tab w:val="center" w:pos="4513"/>
+        <w:tab w:val="right" w:pos="9026"/>
+      </w:tabs>
+      <w:spacing w:after="0" w:line="240" w:lineRule="auto"/>
+    </w:pPr>
+  </w:style>
+  <w:style w:type="character" w:customStyle="1" w:styleId="FooterChar">
+    <w:name w:val="Footer Char"/>
+    <w:basedOn w:val="DefaultParagraphFont"/>
+    <w:link w:val="Footer"/>
+    <w:uiPriority w:val="99"/>
+    <w:rsid w:val="00090478"/>
   </w:style>
 </w:styles>
 </file>

</xml_diff>

<commit_message>
Updated all html pages
</commit_message>
<xml_diff>
--- a/Jobeta_Mandisa_Mar2026_A01.docx
+++ b/Jobeta_Mandisa_Mar2026_A01.docx
@@ -3700,16 +3700,75 @@
         <w:pStyle w:val="ListParagraph"/>
         <w:ind w:left="420"/>
         <w:rPr>
-          <w:sz w:val="28"/>
-          <w:szCs w:val="28"/>
-        </w:rPr>
-      </w:pPr>
-      <w:r>
-        <w:rPr>
-          <w:sz w:val="28"/>
-          <w:szCs w:val="28"/>
-        </w:rPr>
-        <w:t>Device Testing</w:t>
+          <w:i/>
+          <w:iCs/>
+          <w:noProof/>
+        </w:rPr>
+      </w:pPr>
+      <w:r>
+        <w:rPr>
+          <w:i/>
+          <w:iCs/>
+          <w:noProof/>
+          <w:sz w:val="20"/>
+          <w:szCs w:val="20"/>
+        </w:rPr>
+        <w:lastRenderedPageBreak/>
+        <w:t>Google chrome</w:t>
+      </w:r>
+      <w:r>
+        <w:rPr>
+          <w:noProof/>
+        </w:rPr>
+        <w:t xml:space="preserve"> </w:t>
+      </w:r>
+      <w:r>
+        <w:rPr>
+          <w:i/>
+          <w:iCs/>
+          <w:noProof/>
+        </w:rPr>
+        <w:t>screenshot</w:t>
+      </w:r>
+      <w:r>
+        <w:rPr>
+          <w:noProof/>
+        </w:rPr>
+        <w:drawing>
+          <wp:inline distT="0" distB="0" distL="0" distR="0" wp14:anchorId="3869E927" wp14:editId="6992875C">
+            <wp:extent cx="5703376" cy="3208070"/>
+            <wp:effectExtent l="0" t="0" r="0" b="0"/>
+            <wp:docPr id="1493418484" name="Picture 1"/>
+            <wp:cNvGraphicFramePr>
+              <a:graphicFrameLocks xmlns:a="http://schemas.openxmlformats.org/drawingml/2006/main" noChangeAspect="1"/>
+            </wp:cNvGraphicFramePr>
+            <a:graphic xmlns:a="http://schemas.openxmlformats.org/drawingml/2006/main">
+              <a:graphicData uri="http://schemas.openxmlformats.org/drawingml/2006/picture">
+                <pic:pic xmlns:pic="http://schemas.openxmlformats.org/drawingml/2006/picture">
+                  <pic:nvPicPr>
+                    <pic:cNvPr id="1493418484" name=""/>
+                    <pic:cNvPicPr/>
+                  </pic:nvPicPr>
+                  <pic:blipFill>
+                    <a:blip r:embed="rId12"/>
+                    <a:stretch>
+                      <a:fillRect/>
+                    </a:stretch>
+                  </pic:blipFill>
+                  <pic:spPr>
+                    <a:xfrm>
+                      <a:off x="0" y="0"/>
+                      <a:ext cx="5715326" cy="3214792"/>
+                    </a:xfrm>
+                    <a:prstGeom prst="rect">
+                      <a:avLst/>
+                    </a:prstGeom>
+                  </pic:spPr>
+                </pic:pic>
+              </a:graphicData>
+            </a:graphic>
+          </wp:inline>
+        </w:drawing>
       </w:r>
     </w:p>
     <w:p>
@@ -3717,6 +3776,126 @@
         <w:pStyle w:val="ListParagraph"/>
         <w:ind w:left="420"/>
         <w:rPr>
+          <w:i/>
+          <w:iCs/>
+          <w:noProof/>
+          <w:sz w:val="20"/>
+          <w:szCs w:val="20"/>
+        </w:rPr>
+      </w:pPr>
+    </w:p>
+    <w:p>
+      <w:pPr>
+        <w:pStyle w:val="ListParagraph"/>
+        <w:ind w:left="420"/>
+        <w:rPr>
+          <w:sz w:val="28"/>
+          <w:szCs w:val="28"/>
+        </w:rPr>
+      </w:pPr>
+      <w:r>
+        <w:rPr>
+          <w:i/>
+          <w:iCs/>
+          <w:noProof/>
+          <w:sz w:val="20"/>
+          <w:szCs w:val="20"/>
+        </w:rPr>
+        <w:t>Micro</w:t>
+      </w:r>
+      <w:r>
+        <w:rPr>
+          <w:i/>
+          <w:iCs/>
+          <w:noProof/>
+          <w:sz w:val="20"/>
+          <w:szCs w:val="20"/>
+        </w:rPr>
+        <w:t>soft Edge screenshot</w:t>
+      </w:r>
+    </w:p>
+    <w:p>
+      <w:pPr>
+        <w:pStyle w:val="ListParagraph"/>
+        <w:ind w:left="420"/>
+        <w:rPr>
+          <w:sz w:val="28"/>
+          <w:szCs w:val="28"/>
+        </w:rPr>
+      </w:pPr>
+      <w:r>
+        <w:rPr>
+          <w:noProof/>
+        </w:rPr>
+        <w:drawing>
+          <wp:inline distT="0" distB="0" distL="0" distR="0" wp14:anchorId="3B60124E" wp14:editId="38B85F05">
+            <wp:extent cx="5731510" cy="3223895"/>
+            <wp:effectExtent l="0" t="0" r="2540" b="0"/>
+            <wp:docPr id="1638442469" name="Picture 1"/>
+            <wp:cNvGraphicFramePr>
+              <a:graphicFrameLocks xmlns:a="http://schemas.openxmlformats.org/drawingml/2006/main" noChangeAspect="1"/>
+            </wp:cNvGraphicFramePr>
+            <a:graphic xmlns:a="http://schemas.openxmlformats.org/drawingml/2006/main">
+              <a:graphicData uri="http://schemas.openxmlformats.org/drawingml/2006/picture">
+                <pic:pic xmlns:pic="http://schemas.openxmlformats.org/drawingml/2006/picture">
+                  <pic:nvPicPr>
+                    <pic:cNvPr id="1638442469" name=""/>
+                    <pic:cNvPicPr/>
+                  </pic:nvPicPr>
+                  <pic:blipFill>
+                    <a:blip r:embed="rId13"/>
+                    <a:stretch>
+                      <a:fillRect/>
+                    </a:stretch>
+                  </pic:blipFill>
+                  <pic:spPr>
+                    <a:xfrm>
+                      <a:off x="0" y="0"/>
+                      <a:ext cx="5731510" cy="3223895"/>
+                    </a:xfrm>
+                    <a:prstGeom prst="rect">
+                      <a:avLst/>
+                    </a:prstGeom>
+                  </pic:spPr>
+                </pic:pic>
+              </a:graphicData>
+            </a:graphic>
+          </wp:inline>
+        </w:drawing>
+      </w:r>
+    </w:p>
+    <w:p>
+      <w:pPr>
+        <w:pStyle w:val="ListParagraph"/>
+        <w:ind w:left="420"/>
+        <w:rPr>
+          <w:sz w:val="28"/>
+          <w:szCs w:val="28"/>
+        </w:rPr>
+      </w:pPr>
+    </w:p>
+    <w:p>
+      <w:pPr>
+        <w:pStyle w:val="ListParagraph"/>
+        <w:ind w:left="420"/>
+        <w:rPr>
+          <w:sz w:val="28"/>
+          <w:szCs w:val="28"/>
+        </w:rPr>
+      </w:pPr>
+      <w:r>
+        <w:rPr>
+          <w:sz w:val="28"/>
+          <w:szCs w:val="28"/>
+        </w:rPr>
+        <w:t>Device Testing</w:t>
+      </w:r>
+    </w:p>
+    <w:p>
+      <w:pPr>
+        <w:pStyle w:val="ListParagraph"/>
+        <w:ind w:left="420"/>
+        <w:rPr>
           <w:sz w:val="28"/>
           <w:szCs w:val="28"/>
         </w:rPr>
@@ -3754,14 +3933,28 @@
           <w:sz w:val="28"/>
           <w:szCs w:val="28"/>
         </w:rPr>
-        <w:t xml:space="preserve"> –</w:t>
-      </w:r>
-      <w:r>
-        <w:rPr>
-          <w:sz w:val="28"/>
-          <w:szCs w:val="28"/>
-        </w:rPr>
-        <w:t xml:space="preserve"> functionality and user interface</w:t>
+        <w:t xml:space="preserve"> </w:t>
+      </w:r>
+      <w:r>
+        <w:rPr>
+          <w:sz w:val="28"/>
+          <w:szCs w:val="28"/>
+        </w:rPr>
+        <w:t xml:space="preserve">the </w:t>
+      </w:r>
+      <w:r>
+        <w:rPr>
+          <w:sz w:val="28"/>
+          <w:szCs w:val="28"/>
+        </w:rPr>
+        <w:t xml:space="preserve">functionality </w:t>
+      </w:r>
+      <w:r>
+        <w:rPr>
+          <w:sz w:val="28"/>
+          <w:szCs w:val="28"/>
+        </w:rPr>
+        <w:t>of the website across different browser sizes</w:t>
       </w:r>
       <w:r>
         <w:rPr>
@@ -3805,6 +3998,146 @@
         </w:rPr>
         <w:t xml:space="preserve">computer. </w:t>
       </w:r>
+    </w:p>
+    <w:p>
+      <w:pPr>
+        <w:pStyle w:val="ListParagraph"/>
+        <w:ind w:left="420"/>
+        <w:rPr>
+          <w:sz w:val="28"/>
+          <w:szCs w:val="28"/>
+        </w:rPr>
+      </w:pPr>
+    </w:p>
+    <w:p>
+      <w:pPr>
+        <w:pStyle w:val="ListParagraph"/>
+        <w:ind w:left="420"/>
+        <w:rPr>
+          <w:sz w:val="28"/>
+          <w:szCs w:val="28"/>
+        </w:rPr>
+      </w:pPr>
+      <w:r>
+        <w:rPr>
+          <w:noProof/>
+        </w:rPr>
+        <w:lastRenderedPageBreak/>
+        <w:drawing>
+          <wp:inline distT="0" distB="0" distL="0" distR="0" wp14:anchorId="7EBAC9ED" wp14:editId="27B9440E">
+            <wp:extent cx="5731510" cy="3223895"/>
+            <wp:effectExtent l="0" t="0" r="2540" b="0"/>
+            <wp:docPr id="569185449" name="Picture 1"/>
+            <wp:cNvGraphicFramePr>
+              <a:graphicFrameLocks xmlns:a="http://schemas.openxmlformats.org/drawingml/2006/main" noChangeAspect="1"/>
+            </wp:cNvGraphicFramePr>
+            <a:graphic xmlns:a="http://schemas.openxmlformats.org/drawingml/2006/main">
+              <a:graphicData uri="http://schemas.openxmlformats.org/drawingml/2006/picture">
+                <pic:pic xmlns:pic="http://schemas.openxmlformats.org/drawingml/2006/picture">
+                  <pic:nvPicPr>
+                    <pic:cNvPr id="569185449" name=""/>
+                    <pic:cNvPicPr/>
+                  </pic:nvPicPr>
+                  <pic:blipFill>
+                    <a:blip r:embed="rId12"/>
+                    <a:stretch>
+                      <a:fillRect/>
+                    </a:stretch>
+                  </pic:blipFill>
+                  <pic:spPr>
+                    <a:xfrm>
+                      <a:off x="0" y="0"/>
+                      <a:ext cx="5731510" cy="3223895"/>
+                    </a:xfrm>
+                    <a:prstGeom prst="rect">
+                      <a:avLst/>
+                    </a:prstGeom>
+                  </pic:spPr>
+                </pic:pic>
+              </a:graphicData>
+            </a:graphic>
+          </wp:inline>
+        </w:drawing>
+      </w:r>
+    </w:p>
+    <w:p>
+      <w:pPr>
+        <w:pStyle w:val="ListParagraph"/>
+        <w:ind w:left="420"/>
+        <w:rPr>
+          <w:sz w:val="28"/>
+          <w:szCs w:val="28"/>
+        </w:rPr>
+      </w:pPr>
+      <w:r>
+        <w:rPr>
+          <w:sz w:val="28"/>
+          <w:szCs w:val="28"/>
+        </w:rPr>
+        <w:t xml:space="preserve"> </w:t>
+      </w:r>
+    </w:p>
+    <w:p>
+      <w:pPr>
+        <w:pStyle w:val="ListParagraph"/>
+        <w:ind w:left="420"/>
+        <w:rPr>
+          <w:sz w:val="28"/>
+          <w:szCs w:val="28"/>
+        </w:rPr>
+      </w:pPr>
+      <w:r>
+        <w:rPr>
+          <w:sz w:val="28"/>
+          <w:szCs w:val="28"/>
+        </w:rPr>
+        <w:lastRenderedPageBreak/>
+        <w:drawing>
+          <wp:inline distT="0" distB="0" distL="0" distR="0" wp14:anchorId="467C144B" wp14:editId="25C674CB">
+            <wp:extent cx="2704454" cy="5953786"/>
+            <wp:effectExtent l="0" t="0" r="1270" b="0"/>
+            <wp:docPr id="1673107435" name="Picture 1"/>
+            <wp:cNvGraphicFramePr>
+              <a:graphicFrameLocks xmlns:a="http://schemas.openxmlformats.org/drawingml/2006/main" noChangeAspect="1"/>
+            </wp:cNvGraphicFramePr>
+            <a:graphic xmlns:a="http://schemas.openxmlformats.org/drawingml/2006/main">
+              <a:graphicData uri="http://schemas.openxmlformats.org/drawingml/2006/picture">
+                <pic:pic xmlns:pic="http://schemas.openxmlformats.org/drawingml/2006/picture">
+                  <pic:nvPicPr>
+                    <pic:cNvPr id="1673107435" name=""/>
+                    <pic:cNvPicPr/>
+                  </pic:nvPicPr>
+                  <pic:blipFill>
+                    <a:blip r:embed="rId14"/>
+                    <a:stretch>
+                      <a:fillRect/>
+                    </a:stretch>
+                  </pic:blipFill>
+                  <pic:spPr>
+                    <a:xfrm>
+                      <a:off x="0" y="0"/>
+                      <a:ext cx="2712481" cy="5971457"/>
+                    </a:xfrm>
+                    <a:prstGeom prst="rect">
+                      <a:avLst/>
+                    </a:prstGeom>
+                  </pic:spPr>
+                </pic:pic>
+              </a:graphicData>
+            </a:graphic>
+          </wp:inline>
+        </w:drawing>
+      </w:r>
+    </w:p>
+    <w:p>
+      <w:pPr>
+        <w:pStyle w:val="ListParagraph"/>
+        <w:ind w:left="420"/>
+        <w:rPr>
+          <w:sz w:val="28"/>
+          <w:szCs w:val="28"/>
+        </w:rPr>
+      </w:pPr>
     </w:p>
     <w:p>
       <w:pPr>
@@ -3906,7 +4239,77 @@
           <w:sz w:val="28"/>
           <w:szCs w:val="28"/>
         </w:rPr>
-        <w:t xml:space="preserve">The command prompt and the </w:t>
+        <w:t xml:space="preserve">The command prompt and the internal </w:t>
+      </w:r>
+      <w:r>
+        <w:rPr>
+          <w:sz w:val="28"/>
+          <w:szCs w:val="28"/>
+        </w:rPr>
+        <w:t xml:space="preserve">terminal (VS Code) </w:t>
+      </w:r>
+      <w:r>
+        <w:rPr>
+          <w:sz w:val="28"/>
+          <w:szCs w:val="28"/>
+        </w:rPr>
+        <w:t>were used to run all Git</w:t>
+      </w:r>
+      <w:r>
+        <w:rPr>
+          <w:sz w:val="28"/>
+          <w:szCs w:val="28"/>
+        </w:rPr>
+        <w:t>Hub</w:t>
+      </w:r>
+      <w:r>
+        <w:rPr>
+          <w:sz w:val="28"/>
+          <w:szCs w:val="28"/>
+        </w:rPr>
+        <w:t xml:space="preserve"> commands that </w:t>
+      </w:r>
+      <w:r>
+        <w:rPr>
+          <w:sz w:val="28"/>
+          <w:szCs w:val="28"/>
+        </w:rPr>
+        <w:t>were required to host the website it</w:t>
+      </w:r>
+      <w:r>
+        <w:rPr>
+          <w:sz w:val="28"/>
+          <w:szCs w:val="28"/>
+        </w:rPr>
+        <w:t xml:space="preserve">self on GitHub Pages, </w:t>
+      </w:r>
+      <w:r>
+        <w:rPr>
+          <w:sz w:val="28"/>
+          <w:szCs w:val="28"/>
+        </w:rPr>
+        <w:t>a h</w:t>
+      </w:r>
+      <w:r>
+        <w:rPr>
+          <w:sz w:val="28"/>
+          <w:szCs w:val="28"/>
+        </w:rPr>
+        <w:t>ost</w:t>
+      </w:r>
+      <w:r>
+        <w:rPr>
+          <w:sz w:val="28"/>
+          <w:szCs w:val="28"/>
+        </w:rPr>
+        <w:t xml:space="preserve">ing service for </w:t>
+      </w:r>
+      <w:r>
+        <w:rPr>
+          <w:sz w:val="28"/>
+          <w:szCs w:val="28"/>
+        </w:rPr>
+        <w:t xml:space="preserve">personal, organization, or project pages from a GitHub </w:t>
       </w:r>
       <w:r>
         <w:rPr>
@@ -3914,77 +4317,7 @@
           <w:szCs w:val="28"/>
         </w:rPr>
         <w:lastRenderedPageBreak/>
-        <w:t xml:space="preserve">internal </w:t>
-      </w:r>
-      <w:r>
-        <w:rPr>
-          <w:sz w:val="28"/>
-          <w:szCs w:val="28"/>
-        </w:rPr>
-        <w:t xml:space="preserve">terminal (VS Code) </w:t>
-      </w:r>
-      <w:r>
-        <w:rPr>
-          <w:sz w:val="28"/>
-          <w:szCs w:val="28"/>
-        </w:rPr>
-        <w:t>were used to run all Git</w:t>
-      </w:r>
-      <w:r>
-        <w:rPr>
-          <w:sz w:val="28"/>
-          <w:szCs w:val="28"/>
-        </w:rPr>
-        <w:t>Hub</w:t>
-      </w:r>
-      <w:r>
-        <w:rPr>
-          <w:sz w:val="28"/>
-          <w:szCs w:val="28"/>
-        </w:rPr>
-        <w:t xml:space="preserve"> commands that </w:t>
-      </w:r>
-      <w:r>
-        <w:rPr>
-          <w:sz w:val="28"/>
-          <w:szCs w:val="28"/>
-        </w:rPr>
-        <w:t>were required to host the website it</w:t>
-      </w:r>
-      <w:r>
-        <w:rPr>
-          <w:sz w:val="28"/>
-          <w:szCs w:val="28"/>
-        </w:rPr>
-        <w:t xml:space="preserve">self on GitHub Pages, </w:t>
-      </w:r>
-      <w:r>
-        <w:rPr>
-          <w:sz w:val="28"/>
-          <w:szCs w:val="28"/>
-        </w:rPr>
-        <w:t>a h</w:t>
-      </w:r>
-      <w:r>
-        <w:rPr>
-          <w:sz w:val="28"/>
-          <w:szCs w:val="28"/>
-        </w:rPr>
-        <w:t>ost</w:t>
-      </w:r>
-      <w:r>
-        <w:rPr>
-          <w:sz w:val="28"/>
-          <w:szCs w:val="28"/>
-        </w:rPr>
-        <w:t xml:space="preserve">ing service for </w:t>
-      </w:r>
-      <w:r>
-        <w:rPr>
-          <w:sz w:val="28"/>
-          <w:szCs w:val="28"/>
-        </w:rPr>
-        <w:t>personal, organization, or project pages from a GitHub repository</w:t>
+        <w:t>repository</w:t>
       </w:r>
       <w:r>
         <w:rPr>
@@ -4534,7 +4867,7 @@
         </w:rPr>
         <w:t xml:space="preserve">Website link address: </w:t>
       </w:r>
-      <w:hyperlink r:id="rId12" w:history="1">
+      <w:hyperlink r:id="rId15" w:history="1">
         <w:r>
           <w:rPr>
             <w:rStyle w:val="Hyperlink"/>
@@ -4675,7 +5008,7 @@
       </w:pPr>
     </w:p>
     <w:sectPr>
-      <w:footerReference w:type="default" r:id="rId13"/>
+      <w:footerReference w:type="default" r:id="rId16"/>
       <w:pgSz w:w="11906" w:h="16838"/>
       <w:pgMar w:top="1440" w:right="1440" w:bottom="1440" w:left="1440" w:header="708" w:footer="708" w:gutter="0"/>
       <w:cols w:space="708"/>

</xml_diff>